<commit_message>
Hiring-focused Alpha deep dive, DataGlow shots, fix resume downloads
Rewrite CMS Quality + IDR deep dive around analysis and why it matters
with SQL lenses, Python twin, and DataGlow workspace screenshots. Remove
internal keeper jargon. Point PDF/Word downloads at live relative files
and refresh resume exports with Alpha findings.
</commit_message>
<xml_diff>
--- a/client/public/Andre_Weissmann_Resume.docx
+++ b/client/public/Andre_Weissmann_Resume.docx
@@ -16,68 +16,39 @@
     </w:p>
     <w:p>
       <w:pPr>
-        <w:spacing w:after="20" w:before="0"/>
+        <w:spacing w:after="20"/>
+      </w:pPr>
+      <w:r>
+        <w:rPr>
+          <w:b/>
+          <w:sz w:val="22"/>
+        </w:rPr>
+        <w:t>Data Analyst  |  Healthcare Operations and Analytics</w:t>
+      </w:r>
+    </w:p>
+    <w:p>
+      <w:pPr>
+        <w:spacing w:after="20"/>
       </w:pPr>
       <w:r>
         <w:rPr>
           <w:b w:val="0"/>
           <w:sz w:val="20"/>
         </w:rPr>
-        <w:t>Chicago, IL</w:t>
+        <w:t>Chicago, IL  |  andre_weissmann@icloud.com  |  andre-weissmann-data-portfolio.pplx.app</w:t>
       </w:r>
     </w:p>
     <w:p>
       <w:pPr>
-        <w:spacing w:after="20" w:before="0"/>
+        <w:spacing w:after="20"/>
       </w:pPr>
       <w:r>
         <w:rPr>
           <w:b w:val="0"/>
-          <w:sz w:val="20"/>
+          <w:sz w:val="18"/>
         </w:rPr>
-        <w:t>andre_weissmann@icloud.com</w:t>
+        <w:t>linkedin.com/in/andre-weissmann  |  github.com/Andre-Weissmann</w:t>
       </w:r>
-    </w:p>
-    <w:p>
-      <w:pPr>
-        <w:spacing w:after="20" w:before="0"/>
-      </w:pPr>
-      <w:r>
-        <w:rPr>
-          <w:b w:val="0"/>
-          <w:sz w:val="20"/>
-        </w:rPr>
-        <w:t>https://andre-weissmann-data-portfolio-view.pplx.app</w:t>
-      </w:r>
-    </w:p>
-    <w:p>
-      <w:pPr>
-        <w:spacing w:after="20" w:before="0"/>
-      </w:pPr>
-      <w:r>
-        <w:rPr>
-          <w:b w:val="0"/>
-          <w:sz w:val="20"/>
-        </w:rPr>
-        <w:t>https://linkedin.com/in/andre-weissmann</w:t>
-      </w:r>
-    </w:p>
-    <w:p>
-      <w:pPr>
-        <w:spacing w:after="20" w:before="0"/>
-      </w:pPr>
-      <w:r>
-        <w:rPr>
-          <w:b w:val="0"/>
-          <w:sz w:val="20"/>
-        </w:rPr>
-        <w:t>https://github.com/Andre-Weissmann</w:t>
-      </w:r>
-    </w:p>
-    <w:p>
-      <w:pPr>
-        <w:pStyle w:val="ListBullet"/>
-      </w:pPr>
     </w:p>
     <w:p>
       <w:pPr>
@@ -88,30 +59,20 @@
           <w:b/>
           <w:sz w:val="24"/>
         </w:rPr>
-        <w:t>SUMMARY</w:t>
+        <w:t>PROFESSIONAL SUMMARY</w:t>
       </w:r>
     </w:p>
     <w:p>
       <w:pPr>
-        <w:pStyle w:val="ListBullet"/>
-      </w:pPr>
-    </w:p>
-    <w:p>
-      <w:pPr>
-        <w:spacing w:after="20" w:before="0"/>
+        <w:spacing w:after="20"/>
       </w:pPr>
       <w:r>
         <w:rPr>
           <w:b w:val="0"/>
           <w:sz w:val="20"/>
         </w:rPr>
-        <w:t>Data analytics professional with hands-on experience in Microsoft Excel (advanced), Power BI, Tableau, SQL, and Python. Passionate about turning raw data into clear insights that drive decisions. Currently transitioning from operations into a full-time data analyst role, with a growing portfolio of healthcare and business intelligence projects.</w:t>
+        <w:t>Data Analyst with 5+ years embedded in EMS medical billing and healthcare operations. Builds technical solutions for real workflow problems across revenue cycle, claims analytics, and EHR documentation. Toolkit: SQL, Python, Power BI, Tableau, Excel/VBA. Built DataGlow, a local-first analytics workbench, and ships hire-grade public CMS analyses with dual-engine verification.</w:t>
       </w:r>
-    </w:p>
-    <w:p>
-      <w:pPr>
-        <w:pStyle w:val="ListBullet"/>
-      </w:pPr>
     </w:p>
     <w:p>
       <w:pPr>
@@ -122,54 +83,56 @@
           <w:b/>
           <w:sz w:val="24"/>
         </w:rPr>
-        <w:t>TECHNICAL SKILLS</w:t>
+        <w:t>CORE SKILLS</w:t>
       </w:r>
     </w:p>
     <w:p>
       <w:pPr>
-        <w:pStyle w:val="ListBullet"/>
-      </w:pPr>
-    </w:p>
-    <w:p>
-      <w:pPr>
-        <w:spacing w:after="20" w:before="0"/>
+        <w:spacing w:after="20"/>
       </w:pPr>
       <w:r>
         <w:rPr>
           <w:b w:val="0"/>
           <w:sz w:val="20"/>
         </w:rPr>
-        <w:t>Analytics Tools: Microsoft Excel (Power Pivot, Power Query, Macros/VBA), Power BI, Tableau, SQL, Python</w:t>
+        <w:t>Languages and Analytics: SQL, Python, R, VBA, Excel (Power Query, Power Pivot, DAX, Macros)</w:t>
       </w:r>
     </w:p>
     <w:p>
       <w:pPr>
-        <w:spacing w:after="20" w:before="0"/>
+        <w:spacing w:after="20"/>
       </w:pPr>
       <w:r>
         <w:rPr>
           <w:b w:val="0"/>
           <w:sz w:val="20"/>
         </w:rPr>
-        <w:t>Data Skills: Data cleaning, validation, visualization, dashboard design, pivot tables, DAX, chart formatting</w:t>
+        <w:t>Visualization and BI: Power BI, Tableau, Excel, EDA, data cleaning and validation</w:t>
       </w:r>
     </w:p>
     <w:p>
       <w:pPr>
-        <w:spacing w:after="20" w:before="0"/>
+        <w:spacing w:after="20"/>
       </w:pPr>
       <w:r>
         <w:rPr>
           <w:b w:val="0"/>
           <w:sz w:val="20"/>
         </w:rPr>
-        <w:t>Other Tools: Microsoft Copilot (AI-assisted debugging for VBA macros), Git/GitHub, Databricks (Associate level)</w:t>
+        <w:t>Healthcare Domain: Revenue cycle, claims analytics, medical billing, ICD-10, CPT, denials, AR, prior auth, HIPAA awareness, EHR/EMR, HL7, FHIR, EDI 837/835</w:t>
       </w:r>
     </w:p>
     <w:p>
       <w:pPr>
-        <w:pStyle w:val="ListBullet"/>
+        <w:spacing w:after="20"/>
       </w:pPr>
+      <w:r>
+        <w:rPr>
+          <w:b w:val="0"/>
+          <w:sz w:val="20"/>
+        </w:rPr>
+        <w:t>AI and Automation: Microsoft Copilot, prompt engineering, GitHub, local-first analytics tooling (DataGlow)</w:t>
+      </w:r>
     </w:p>
     <w:p>
       <w:pPr>
@@ -180,212 +143,148 @@
           <w:b/>
           <w:sz w:val="24"/>
         </w:rPr>
-        <w:t>PROJECTS</w:t>
+        <w:t>DATA ANALYTICS PROJECTS</w:t>
+      </w:r>
+    </w:p>
+    <w:p>
+      <w:pPr>
+        <w:spacing w:after="20"/>
+      </w:pPr>
+      <w:r>
+        <w:rPr>
+          <w:b/>
+          <w:sz w:val="20"/>
+        </w:rPr>
+        <w:t>CMS Marketplace Quality Stars + Federal IDR Outcomes (SQL + Python) | 2026</w:t>
       </w:r>
     </w:p>
     <w:p>
       <w:pPr>
         <w:pStyle w:val="ListBullet"/>
-      </w:pPr>
-    </w:p>
-    <w:p>
-      <w:pPr>
-        <w:spacing w:after="20" w:before="0"/>
+        <w:spacing w:after="0"/>
       </w:pPr>
       <w:r>
         <w:rPr>
-          <w:b w:val="0"/>
           <w:sz w:val="20"/>
         </w:rPr>
-        <w:t>CMS Marketplace Quality + Federal IDR Outcomes (SQL + Python)</w:t>
+        <w:t>Analyzed CMS Marketplace Quality PUF (PY2026, 4,302 plans) and Federal IDR supplemental tables (2025 Q1-Q2)</w:t>
       </w:r>
     </w:p>
     <w:p>
       <w:pPr>
         <w:pStyle w:val="ListBullet"/>
+        <w:spacing w:after="0"/>
       </w:pPr>
       <w:r>
         <w:rPr>
           <w:sz w:val="20"/>
         </w:rPr>
-        <w:t>Analyzed CMS Marketplace Quality PUF (PY2026, 4,302 plans) and Federal IDR Supplemental tables (2025 Q1-Q2)</w:t>
+        <w:t>Applied Not Rated (NR) exclusion so unrated plans never drag star averages toward zero</w:t>
       </w:r>
     </w:p>
     <w:p>
       <w:pPr>
         <w:pStyle w:val="ListBullet"/>
+        <w:spacing w:after="0"/>
       </w:pPr>
       <w:r>
         <w:rPr>
           <w:sz w:val="20"/>
         </w:rPr>
-        <w:t>Dual-engine checked five human-confirmed keepers with NR exclusion discipline (never treat NR as 0)</w:t>
+        <w:t>Findings: EPO leads plan-type overall stars after NR exclusion (3.24, n=922); IDR provider prevailing share 87.4% (Q1) to 88.2% (Q2); Plan Administration ≥ Overall+1 star on 48.8% of dual-rated plans (1,531/3,139)</w:t>
       </w:r>
     </w:p>
     <w:p>
       <w:pPr>
         <w:pStyle w:val="ListBullet"/>
+        <w:spacing w:after="0"/>
       </w:pPr>
       <w:r>
         <w:rPr>
           <w:sz w:val="20"/>
         </w:rPr>
-        <w:t>Key results: EPO leads overall stars after NR exclusion (3.24); IDR provider prevailing share 87.4% to 88.2% Q1 to Q2; Admin at least 1 star above Overall on 48.8% of dual-rated plans</w:t>
+        <w:t>Reproduced results in SQL and Python on the same public files; explored workflow in DataGlow</w:t>
+      </w:r>
+    </w:p>
+    <w:p>
+      <w:pPr>
+        <w:spacing w:after="20"/>
+      </w:pPr>
+      <w:r>
+        <w:rPr>
+          <w:b/>
+          <w:sz w:val="20"/>
+        </w:rPr>
+        <w:t>Nashville Housing Data Cleaning (SQL)</w:t>
       </w:r>
     </w:p>
     <w:p>
       <w:pPr>
         <w:pStyle w:val="ListBullet"/>
+        <w:spacing w:after="0"/>
       </w:pPr>
       <w:r>
         <w:rPr>
           <w:sz w:val="20"/>
         </w:rPr>
-        <w:t>Skills: SQL, Python, healthcare public data, data quality definitions, reproducible proof</w:t>
+        <w:t>Cleaned 56,477 Metro Nashville sales rows: address recovery, duplicate closings, vacancy standardization</w:t>
       </w:r>
     </w:p>
     <w:p>
       <w:pPr>
-        <w:spacing w:after="20" w:before="0"/>
+        <w:spacing w:after="20"/>
       </w:pPr>
       <w:r>
         <w:rPr>
-          <w:b w:val="0"/>
+          <w:b/>
           <w:sz w:val="20"/>
         </w:rPr>
-        <w:t>Nashville Housing Data Cleanup (SQL)</w:t>
+        <w:t>Data Professionals Survey (Power BI)</w:t>
       </w:r>
     </w:p>
     <w:p>
       <w:pPr>
         <w:pStyle w:val="ListBullet"/>
+        <w:spacing w:after="0"/>
       </w:pPr>
       <w:r>
         <w:rPr>
           <w:sz w:val="20"/>
         </w:rPr>
-        <w:t>Cleaned and standardized 56,000+ Nashville housing records using SQL</w:t>
+        <w:t>Dashboard on 630 responses; salary patterns by role and education</w:t>
+      </w:r>
+    </w:p>
+    <w:p>
+      <w:pPr>
+        <w:spacing w:after="20"/>
+      </w:pPr>
+      <w:r>
+        <w:rPr>
+          <w:b/>
+          <w:sz w:val="20"/>
+        </w:rPr>
+        <w:t>Airbnb Seattle Analysis (Tableau)</w:t>
       </w:r>
     </w:p>
     <w:p>
       <w:pPr>
         <w:pStyle w:val="ListBullet"/>
+        <w:spacing w:after="0"/>
       </w:pPr>
       <w:r>
         <w:rPr>
           <w:sz w:val="20"/>
         </w:rPr>
-        <w:t>Removed duplicates, parsed addresses, normalized categorical fields</w:t>
+        <w:t>Joined listings/calendar/reviews; peak weekly revenue and bedroom pricing patterns</w:t>
       </w:r>
     </w:p>
     <w:p>
       <w:pPr>
-        <w:pStyle w:val="ListBullet"/>
+        <w:spacing w:after="20"/>
       </w:pPr>
       <w:r>
         <w:rPr>
-          <w:sz w:val="20"/>
-        </w:rPr>
-        <w:t>Skills: SQL, data cleaning, data standardization</w:t>
-      </w:r>
-    </w:p>
-    <w:p>
-      <w:pPr>
-        <w:spacing w:after="20" w:before="0"/>
-      </w:pPr>
-      <w:r>
-        <w:rPr>
-          <w:b w:val="0"/>
-          <w:sz w:val="20"/>
-        </w:rPr>
-        <w:t>Employee Survey Response Analysis (Power BI)</w:t>
-      </w:r>
-    </w:p>
-    <w:p>
-      <w:pPr>
-        <w:pStyle w:val="ListBullet"/>
-      </w:pPr>
-      <w:r>
-        <w:rPr>
-          <w:sz w:val="20"/>
-        </w:rPr>
-        <w:t>Built interactive Power BI dashboard analyzing employee satisfaction across departments</w:t>
-      </w:r>
-    </w:p>
-    <w:p>
-      <w:pPr>
-        <w:pStyle w:val="ListBullet"/>
-      </w:pPr>
-      <w:r>
-        <w:rPr>
-          <w:sz w:val="20"/>
-        </w:rPr>
-        <w:t>Identified key drivers of attrition using slicers and drill-through reports</w:t>
-      </w:r>
-    </w:p>
-    <w:p>
-      <w:pPr>
-        <w:pStyle w:val="ListBullet"/>
-      </w:pPr>
-      <w:r>
-        <w:rPr>
-          <w:sz w:val="20"/>
-        </w:rPr>
-        <w:t>Skills: Power BI, DAX, data visualization, HR analytics</w:t>
-      </w:r>
-    </w:p>
-    <w:p>
-      <w:pPr>
-        <w:spacing w:after="20" w:before="0"/>
-      </w:pPr>
-      <w:r>
-        <w:rPr>
-          <w:b w:val="0"/>
-          <w:sz w:val="20"/>
-        </w:rPr>
-        <w:t>Airbnb NYC Listings Analysis (Tableau)</w:t>
-      </w:r>
-    </w:p>
-    <w:p>
-      <w:pPr>
-        <w:pStyle w:val="ListBullet"/>
-      </w:pPr>
-      <w:r>
-        <w:rPr>
-          <w:sz w:val="20"/>
-        </w:rPr>
-        <w:t>Developed Tableau dashboard analyzing 20,000+ NYC Airbnb listings</w:t>
-      </w:r>
-    </w:p>
-    <w:p>
-      <w:pPr>
-        <w:pStyle w:val="ListBullet"/>
-      </w:pPr>
-      <w:r>
-        <w:rPr>
-          <w:sz w:val="20"/>
-        </w:rPr>
-        <w:t>Visualized pricing trends by neighborhood, room type, and availability</w:t>
-      </w:r>
-    </w:p>
-    <w:p>
-      <w:pPr>
-        <w:pStyle w:val="ListBullet"/>
-      </w:pPr>
-      <w:r>
-        <w:rPr>
-          <w:sz w:val="20"/>
-        </w:rPr>
-        <w:t>Skills: Tableau, geographic data, trend analysis</w:t>
-      </w:r>
-    </w:p>
-    <w:p>
-      <w:pPr>
-        <w:spacing w:after="20" w:before="0"/>
-      </w:pPr>
-      <w:r>
-        <w:rPr>
-          <w:b w:val="0"/>
+          <w:b/>
           <w:sz w:val="20"/>
         </w:rPr>
         <w:t>BMI Health Calculator (Python)</w:t>
@@ -394,32 +293,22 @@
     <w:p>
       <w:pPr>
         <w:pStyle w:val="ListBullet"/>
+        <w:spacing w:after="0"/>
       </w:pPr>
       <w:r>
         <w:rPr>
           <w:sz w:val="20"/>
         </w:rPr>
-        <w:t>Built Python script calculating BMI with weight/height inputs and health category output</w:t>
+        <w:t>Interactive BMI and WHR screening tool with transparent formulas</w:t>
       </w:r>
     </w:p>
     <w:p>
       <w:pPr>
-        <w:pStyle w:val="ListBullet"/>
+        <w:spacing w:after="20"/>
       </w:pPr>
       <w:r>
         <w:rPr>
-          <w:sz w:val="20"/>
-        </w:rPr>
-        <w:t>Skills: Python, user input handling, conditional logic</w:t>
-      </w:r>
-    </w:p>
-    <w:p>
-      <w:pPr>
-        <w:spacing w:after="20" w:before="0"/>
-      </w:pPr>
-      <w:r>
-        <w:rPr>
-          <w:b w:val="0"/>
+          <w:b/>
           <w:sz w:val="20"/>
         </w:rPr>
         <w:t>Bike Sales Dashboard (Excel)</w:t>
@@ -428,40 +317,14 @@
     <w:p>
       <w:pPr>
         <w:pStyle w:val="ListBullet"/>
+        <w:spacing w:after="0"/>
       </w:pPr>
       <w:r>
         <w:rPr>
           <w:sz w:val="20"/>
         </w:rPr>
-        <w:t>Created interactive Excel dashboard with pivot tables and slicers for bike sales data</w:t>
+        <w:t>Buyer segmentation with pivots and slicers</w:t>
       </w:r>
-    </w:p>
-    <w:p>
-      <w:pPr>
-        <w:pStyle w:val="ListBullet"/>
-      </w:pPr>
-      <w:r>
-        <w:rPr>
-          <w:sz w:val="20"/>
-        </w:rPr>
-        <w:t>Segmented data by demographics, region, and commute distance</w:t>
-      </w:r>
-    </w:p>
-    <w:p>
-      <w:pPr>
-        <w:pStyle w:val="ListBullet"/>
-      </w:pPr>
-      <w:r>
-        <w:rPr>
-          <w:sz w:val="20"/>
-        </w:rPr>
-        <w:t>Skills: Excel, pivot tables, data visualization, dashboard design</w:t>
-      </w:r>
-    </w:p>
-    <w:p>
-      <w:pPr>
-        <w:pStyle w:val="ListBullet"/>
-      </w:pPr>
     </w:p>
     <w:p>
       <w:pPr>
@@ -477,173 +340,87 @@
     </w:p>
     <w:p>
       <w:pPr>
-        <w:pStyle w:val="ListBullet"/>
-      </w:pPr>
-    </w:p>
-    <w:p>
-      <w:pPr>
-        <w:spacing w:after="20" w:before="0"/>
+        <w:spacing w:after="20"/>
       </w:pPr>
       <w:r>
         <w:rPr>
-          <w:b w:val="0"/>
+          <w:b/>
           <w:sz w:val="20"/>
         </w:rPr>
-        <w:t>EMS|MC (Emergency Medical Services Medical Center)</w:t>
-      </w:r>
-    </w:p>
-    <w:p>
-      <w:pPr>
-        <w:spacing w:after="20" w:before="0"/>
-      </w:pPr>
-      <w:r>
-        <w:rPr>
-          <w:b w:val="0"/>
-          <w:sz w:val="20"/>
-        </w:rPr>
-        <w:t>Mailroom Specialist | Chicago, IL</w:t>
+        <w:t>EMS Management and Consultants — Mailroom Specialist (Billing and Claims Operations)</w:t>
       </w:r>
     </w:p>
     <w:p>
       <w:pPr>
         <w:pStyle w:val="ListBullet"/>
+        <w:spacing w:after="0"/>
       </w:pPr>
       <w:r>
         <w:rPr>
           <w:sz w:val="20"/>
         </w:rPr>
-        <w:t>Processed and routed incoming/outgoing mail and packages across departments</w:t>
+        <w:t>Billing and claims operations support; Excel macro automation for repetitive entry</w:t>
       </w:r>
     </w:p>
     <w:p>
       <w:pPr>
         <w:pStyle w:val="ListBullet"/>
+        <w:spacing w:after="0"/>
       </w:pPr>
       <w:r>
         <w:rPr>
           <w:sz w:val="20"/>
         </w:rPr>
-        <w:t>Managed check processing, tape operations, and data entry workflows using Excel macros</w:t>
+        <w:t>Supported tape/check and data entry processes used by revenue cycle teams</w:t>
+      </w:r>
+    </w:p>
+    <w:p>
+      <w:pPr>
+        <w:spacing w:after="20"/>
+      </w:pPr>
+      <w:r>
+        <w:rPr>
+          <w:b/>
+          <w:sz w:val="20"/>
+        </w:rPr>
+        <w:t>Walmart — Associate | Palatine, IL</w:t>
       </w:r>
     </w:p>
     <w:p>
       <w:pPr>
         <w:pStyle w:val="ListBullet"/>
+        <w:spacing w:after="0"/>
       </w:pPr>
       <w:r>
         <w:rPr>
           <w:sz w:val="20"/>
         </w:rPr>
-        <w:t>Developed and maintained VBA macros to automate repetitive data entry tasks</w:t>
+        <w:t>Customer service, inventory, and store operations</w:t>
+      </w:r>
+    </w:p>
+    <w:p>
+      <w:pPr>
+        <w:spacing w:after="20"/>
+      </w:pPr>
+      <w:r>
+        <w:rPr>
+          <w:b/>
+          <w:sz w:val="20"/>
+        </w:rPr>
+        <w:t>Goodwill — Associate | Palatine, IL</w:t>
       </w:r>
     </w:p>
     <w:p>
       <w:pPr>
         <w:pStyle w:val="ListBullet"/>
+        <w:spacing w:after="0"/>
       </w:pPr>
       <w:r>
         <w:rPr>
           <w:sz w:val="20"/>
         </w:rPr>
-        <w:t>Utilized Microsoft Copilot to debug Visual Basic runtime errors during macro development</w:t>
+        <w:t>Customer assistance, merchandising, donations processing</w:t>
       </w:r>
-    </w:p>
-    <w:p>
-      <w:pPr>
-        <w:spacing w:after="20" w:before="0"/>
-      </w:pPr>
-      <w:r>
-        <w:rPr>
-          <w:b w:val="0"/>
-          <w:sz w:val="20"/>
-        </w:rPr>
-        <w:t>Walmart</w:t>
-      </w:r>
-    </w:p>
-    <w:p>
-      <w:pPr>
-        <w:spacing w:after="20" w:before="0"/>
-      </w:pPr>
-      <w:r>
-        <w:rPr>
-          <w:b w:val="0"/>
-          <w:sz w:val="20"/>
-        </w:rPr>
-        <w:t>Associate | Palatine, IL</w:t>
-      </w:r>
-    </w:p>
-    <w:p>
-      <w:pPr>
-        <w:pStyle w:val="ListBullet"/>
-      </w:pPr>
-      <w:r>
-        <w:rPr>
-          <w:sz w:val="20"/>
-        </w:rPr>
-        <w:t>Provided customer service and maintained store operations</w:t>
-      </w:r>
-    </w:p>
-    <w:p>
-      <w:pPr>
-        <w:pStyle w:val="ListBullet"/>
-      </w:pPr>
-      <w:r>
-        <w:rPr>
-          <w:sz w:val="20"/>
-        </w:rPr>
-        <w:t>Handled inventory management and product stocking</w:t>
-      </w:r>
-    </w:p>
-    <w:p>
-      <w:pPr>
-        <w:spacing w:after="20" w:before="0"/>
-      </w:pPr>
-      <w:r>
-        <w:rPr>
-          <w:b w:val="0"/>
-          <w:sz w:val="20"/>
-        </w:rPr>
-        <w:t>Goodwill</w:t>
-      </w:r>
-    </w:p>
-    <w:p>
-      <w:pPr>
-        <w:spacing w:after="20" w:before="0"/>
-      </w:pPr>
-      <w:r>
-        <w:rPr>
-          <w:b w:val="0"/>
-          <w:sz w:val="20"/>
-        </w:rPr>
-        <w:t>Associate | Palatine, IL</w:t>
-      </w:r>
-    </w:p>
-    <w:p>
-      <w:pPr>
-        <w:pStyle w:val="ListBullet"/>
-      </w:pPr>
-      <w:r>
-        <w:rPr>
-          <w:sz w:val="20"/>
-        </w:rPr>
-        <w:t>Assisted customers and maintained merchandise displays</w:t>
-      </w:r>
-    </w:p>
-    <w:p>
-      <w:pPr>
-        <w:pStyle w:val="ListBullet"/>
-      </w:pPr>
-      <w:r>
-        <w:rPr>
-          <w:sz w:val="20"/>
-        </w:rPr>
-        <w:t>Processed donations and managed sales floor organization</w:t>
-      </w:r>
-    </w:p>
-    <w:p>
-      <w:pPr>
-        <w:pStyle w:val="ListBullet"/>
-      </w:pPr>
     </w:p>
     <w:p>
       <w:pPr>
@@ -654,102 +431,36 @@
           <w:b/>
           <w:sz w:val="24"/>
         </w:rPr>
-        <w:t>EDUCATION</w:t>
+        <w:t>EDUCATION AND LEARNING</w:t>
       </w:r>
     </w:p>
     <w:p>
       <w:pPr>
-        <w:pStyle w:val="ListBullet"/>
-      </w:pPr>
-    </w:p>
-    <w:p>
-      <w:pPr>
-        <w:spacing w:after="20" w:before="0"/>
+        <w:spacing w:after="20"/>
       </w:pPr>
       <w:r>
         <w:rPr>
           <w:b w:val="0"/>
           <w:sz w:val="20"/>
         </w:rPr>
-        <w:t>Bachelor of Arts</w:t>
+        <w:t>Bachelor of Arts — Graduated 2022</w:t>
       </w:r>
     </w:p>
     <w:p>
       <w:pPr>
-        <w:spacing w:after="20" w:before="0"/>
+        <w:spacing w:after="20"/>
       </w:pPr>
       <w:r>
         <w:rPr>
           <w:b w:val="0"/>
           <w:sz w:val="20"/>
         </w:rPr>
-        <w:t>Graduated 2022</w:t>
+        <w:t>Ongoing analytics coursework; DataGlow local-first workbench: https://dataglow-platform.pplx.app</w:t>
       </w:r>
-    </w:p>
-    <w:p>
-      <w:pPr>
-        <w:spacing w:after="20" w:before="0"/>
-      </w:pPr>
-      <w:r>
-        <w:rPr>
-          <w:b w:val="0"/>
-          <w:sz w:val="20"/>
-        </w:rPr>
-        <w:t>Ongoing Learning:</w:t>
-      </w:r>
-    </w:p>
-    <w:p>
-      <w:pPr>
-        <w:pStyle w:val="ListBullet"/>
-      </w:pPr>
-      <w:r>
-        <w:rPr>
-          <w:sz w:val="20"/>
-        </w:rPr>
-        <w:t>Maven Analytics — Data Analytics portfolio coursework</w:t>
-      </w:r>
-    </w:p>
-    <w:p>
-      <w:pPr>
-        <w:pStyle w:val="ListBullet"/>
-      </w:pPr>
-      <w:r>
-        <w:rPr>
-          <w:sz w:val="20"/>
-        </w:rPr>
-        <w:t>Analyst Builder — SQL and Python certifications</w:t>
-      </w:r>
-    </w:p>
-    <w:p>
-      <w:pPr>
-        <w:pStyle w:val="ListBullet"/>
-      </w:pPr>
-      <w:r>
-        <w:rPr>
-          <w:sz w:val="20"/>
-        </w:rPr>
-        <w:t>Databricks Generative AI Associate Certificate (2024)</w:t>
-      </w:r>
-    </w:p>
-    <w:p>
-      <w:pPr>
-        <w:pStyle w:val="ListBullet"/>
-      </w:pPr>
-      <w:r>
-        <w:rPr>
-          <w:sz w:val="20"/>
-        </w:rPr>
-        <w:t>Databricks Certified Context Engineer Associate</w:t>
-      </w:r>
-    </w:p>
-    <w:p>
-      <w:pPr>
-        <w:pStyle w:val="ListBullet"/>
-      </w:pPr>
     </w:p>
     <w:sectPr>
       <w:pgSz w:w="12240" w:h="15840"/>
-      <w:pgMar w:top="864" w:right="1008" w:bottom="864" w:left="1008" w:header="720" w:footer="720" w:gutter="0"/>
+      <w:pgMar w:top="792" w:right="1008" w:bottom="792" w:left="1008" w:header="720" w:footer="720" w:gutter="0"/>
       <w:cols w:space="720"/>
       <w:docGrid w:linePitch="360"/>
     </w:sectPr>

</xml_diff>

<commit_message>
Hiring-focused Alpha deep dive, DataGlow shots, fix resume downloads (#89)
Rewrite CMS Quality + IDR deep dive around analysis and why it matters
with SQL lenses, Python twin, and DataGlow workspace screenshots. Remove
internal keeper jargon. Point PDF/Word downloads at live relative files
and refresh resume exports with Alpha findings.

Co-authored-by: Andre Weissmann <andre@users.noreply.github.com>
</commit_message>
<xml_diff>
--- a/client/public/Andre_Weissmann_Resume.docx
+++ b/client/public/Andre_Weissmann_Resume.docx
@@ -16,68 +16,39 @@
     </w:p>
     <w:p>
       <w:pPr>
-        <w:spacing w:after="20" w:before="0"/>
+        <w:spacing w:after="20"/>
+      </w:pPr>
+      <w:r>
+        <w:rPr>
+          <w:b/>
+          <w:sz w:val="22"/>
+        </w:rPr>
+        <w:t>Data Analyst  |  Healthcare Operations and Analytics</w:t>
+      </w:r>
+    </w:p>
+    <w:p>
+      <w:pPr>
+        <w:spacing w:after="20"/>
       </w:pPr>
       <w:r>
         <w:rPr>
           <w:b w:val="0"/>
           <w:sz w:val="20"/>
         </w:rPr>
-        <w:t>Chicago, IL</w:t>
+        <w:t>Chicago, IL  |  andre_weissmann@icloud.com  |  andre-weissmann-data-portfolio.pplx.app</w:t>
       </w:r>
     </w:p>
     <w:p>
       <w:pPr>
-        <w:spacing w:after="20" w:before="0"/>
+        <w:spacing w:after="20"/>
       </w:pPr>
       <w:r>
         <w:rPr>
           <w:b w:val="0"/>
-          <w:sz w:val="20"/>
+          <w:sz w:val="18"/>
         </w:rPr>
-        <w:t>andre_weissmann@icloud.com</w:t>
+        <w:t>linkedin.com/in/andre-weissmann  |  github.com/Andre-Weissmann</w:t>
       </w:r>
-    </w:p>
-    <w:p>
-      <w:pPr>
-        <w:spacing w:after="20" w:before="0"/>
-      </w:pPr>
-      <w:r>
-        <w:rPr>
-          <w:b w:val="0"/>
-          <w:sz w:val="20"/>
-        </w:rPr>
-        <w:t>https://andre-weissmann-data-portfolio-view.pplx.app</w:t>
-      </w:r>
-    </w:p>
-    <w:p>
-      <w:pPr>
-        <w:spacing w:after="20" w:before="0"/>
-      </w:pPr>
-      <w:r>
-        <w:rPr>
-          <w:b w:val="0"/>
-          <w:sz w:val="20"/>
-        </w:rPr>
-        <w:t>https://linkedin.com/in/andre-weissmann</w:t>
-      </w:r>
-    </w:p>
-    <w:p>
-      <w:pPr>
-        <w:spacing w:after="20" w:before="0"/>
-      </w:pPr>
-      <w:r>
-        <w:rPr>
-          <w:b w:val="0"/>
-          <w:sz w:val="20"/>
-        </w:rPr>
-        <w:t>https://github.com/Andre-Weissmann</w:t>
-      </w:r>
-    </w:p>
-    <w:p>
-      <w:pPr>
-        <w:pStyle w:val="ListBullet"/>
-      </w:pPr>
     </w:p>
     <w:p>
       <w:pPr>
@@ -88,30 +59,20 @@
           <w:b/>
           <w:sz w:val="24"/>
         </w:rPr>
-        <w:t>SUMMARY</w:t>
+        <w:t>PROFESSIONAL SUMMARY</w:t>
       </w:r>
     </w:p>
     <w:p>
       <w:pPr>
-        <w:pStyle w:val="ListBullet"/>
-      </w:pPr>
-    </w:p>
-    <w:p>
-      <w:pPr>
-        <w:spacing w:after="20" w:before="0"/>
+        <w:spacing w:after="20"/>
       </w:pPr>
       <w:r>
         <w:rPr>
           <w:b w:val="0"/>
           <w:sz w:val="20"/>
         </w:rPr>
-        <w:t>Data analytics professional with hands-on experience in Microsoft Excel (advanced), Power BI, Tableau, SQL, and Python. Passionate about turning raw data into clear insights that drive decisions. Currently transitioning from operations into a full-time data analyst role, with a growing portfolio of healthcare and business intelligence projects.</w:t>
+        <w:t>Data Analyst with 5+ years embedded in EMS medical billing and healthcare operations. Builds technical solutions for real workflow problems across revenue cycle, claims analytics, and EHR documentation. Toolkit: SQL, Python, Power BI, Tableau, Excel/VBA. Built DataGlow, a local-first analytics workbench, and ships hire-grade public CMS analyses with dual-engine verification.</w:t>
       </w:r>
-    </w:p>
-    <w:p>
-      <w:pPr>
-        <w:pStyle w:val="ListBullet"/>
-      </w:pPr>
     </w:p>
     <w:p>
       <w:pPr>
@@ -122,54 +83,56 @@
           <w:b/>
           <w:sz w:val="24"/>
         </w:rPr>
-        <w:t>TECHNICAL SKILLS</w:t>
+        <w:t>CORE SKILLS</w:t>
       </w:r>
     </w:p>
     <w:p>
       <w:pPr>
-        <w:pStyle w:val="ListBullet"/>
-      </w:pPr>
-    </w:p>
-    <w:p>
-      <w:pPr>
-        <w:spacing w:after="20" w:before="0"/>
+        <w:spacing w:after="20"/>
       </w:pPr>
       <w:r>
         <w:rPr>
           <w:b w:val="0"/>
           <w:sz w:val="20"/>
         </w:rPr>
-        <w:t>Analytics Tools: Microsoft Excel (Power Pivot, Power Query, Macros/VBA), Power BI, Tableau, SQL, Python</w:t>
+        <w:t>Languages and Analytics: SQL, Python, R, VBA, Excel (Power Query, Power Pivot, DAX, Macros)</w:t>
       </w:r>
     </w:p>
     <w:p>
       <w:pPr>
-        <w:spacing w:after="20" w:before="0"/>
+        <w:spacing w:after="20"/>
       </w:pPr>
       <w:r>
         <w:rPr>
           <w:b w:val="0"/>
           <w:sz w:val="20"/>
         </w:rPr>
-        <w:t>Data Skills: Data cleaning, validation, visualization, dashboard design, pivot tables, DAX, chart formatting</w:t>
+        <w:t>Visualization and BI: Power BI, Tableau, Excel, EDA, data cleaning and validation</w:t>
       </w:r>
     </w:p>
     <w:p>
       <w:pPr>
-        <w:spacing w:after="20" w:before="0"/>
+        <w:spacing w:after="20"/>
       </w:pPr>
       <w:r>
         <w:rPr>
           <w:b w:val="0"/>
           <w:sz w:val="20"/>
         </w:rPr>
-        <w:t>Other Tools: Microsoft Copilot (AI-assisted debugging for VBA macros), Git/GitHub, Databricks (Associate level)</w:t>
+        <w:t>Healthcare Domain: Revenue cycle, claims analytics, medical billing, ICD-10, CPT, denials, AR, prior auth, HIPAA awareness, EHR/EMR, HL7, FHIR, EDI 837/835</w:t>
       </w:r>
     </w:p>
     <w:p>
       <w:pPr>
-        <w:pStyle w:val="ListBullet"/>
+        <w:spacing w:after="20"/>
       </w:pPr>
+      <w:r>
+        <w:rPr>
+          <w:b w:val="0"/>
+          <w:sz w:val="20"/>
+        </w:rPr>
+        <w:t>AI and Automation: Microsoft Copilot, prompt engineering, GitHub, local-first analytics tooling (DataGlow)</w:t>
+      </w:r>
     </w:p>
     <w:p>
       <w:pPr>
@@ -180,212 +143,148 @@
           <w:b/>
           <w:sz w:val="24"/>
         </w:rPr>
-        <w:t>PROJECTS</w:t>
+        <w:t>DATA ANALYTICS PROJECTS</w:t>
+      </w:r>
+    </w:p>
+    <w:p>
+      <w:pPr>
+        <w:spacing w:after="20"/>
+      </w:pPr>
+      <w:r>
+        <w:rPr>
+          <w:b/>
+          <w:sz w:val="20"/>
+        </w:rPr>
+        <w:t>CMS Marketplace Quality Stars + Federal IDR Outcomes (SQL + Python) | 2026</w:t>
       </w:r>
     </w:p>
     <w:p>
       <w:pPr>
         <w:pStyle w:val="ListBullet"/>
-      </w:pPr>
-    </w:p>
-    <w:p>
-      <w:pPr>
-        <w:spacing w:after="20" w:before="0"/>
+        <w:spacing w:after="0"/>
       </w:pPr>
       <w:r>
         <w:rPr>
-          <w:b w:val="0"/>
           <w:sz w:val="20"/>
         </w:rPr>
-        <w:t>CMS Marketplace Quality + Federal IDR Outcomes (SQL + Python)</w:t>
+        <w:t>Analyzed CMS Marketplace Quality PUF (PY2026, 4,302 plans) and Federal IDR supplemental tables (2025 Q1-Q2)</w:t>
       </w:r>
     </w:p>
     <w:p>
       <w:pPr>
         <w:pStyle w:val="ListBullet"/>
+        <w:spacing w:after="0"/>
       </w:pPr>
       <w:r>
         <w:rPr>
           <w:sz w:val="20"/>
         </w:rPr>
-        <w:t>Analyzed CMS Marketplace Quality PUF (PY2026, 4,302 plans) and Federal IDR Supplemental tables (2025 Q1-Q2)</w:t>
+        <w:t>Applied Not Rated (NR) exclusion so unrated plans never drag star averages toward zero</w:t>
       </w:r>
     </w:p>
     <w:p>
       <w:pPr>
         <w:pStyle w:val="ListBullet"/>
+        <w:spacing w:after="0"/>
       </w:pPr>
       <w:r>
         <w:rPr>
           <w:sz w:val="20"/>
         </w:rPr>
-        <w:t>Dual-engine checked five human-confirmed keepers with NR exclusion discipline (never treat NR as 0)</w:t>
+        <w:t>Findings: EPO leads plan-type overall stars after NR exclusion (3.24, n=922); IDR provider prevailing share 87.4% (Q1) to 88.2% (Q2); Plan Administration ≥ Overall+1 star on 48.8% of dual-rated plans (1,531/3,139)</w:t>
       </w:r>
     </w:p>
     <w:p>
       <w:pPr>
         <w:pStyle w:val="ListBullet"/>
+        <w:spacing w:after="0"/>
       </w:pPr>
       <w:r>
         <w:rPr>
           <w:sz w:val="20"/>
         </w:rPr>
-        <w:t>Key results: EPO leads overall stars after NR exclusion (3.24); IDR provider prevailing share 87.4% to 88.2% Q1 to Q2; Admin at least 1 star above Overall on 48.8% of dual-rated plans</w:t>
+        <w:t>Reproduced results in SQL and Python on the same public files; explored workflow in DataGlow</w:t>
+      </w:r>
+    </w:p>
+    <w:p>
+      <w:pPr>
+        <w:spacing w:after="20"/>
+      </w:pPr>
+      <w:r>
+        <w:rPr>
+          <w:b/>
+          <w:sz w:val="20"/>
+        </w:rPr>
+        <w:t>Nashville Housing Data Cleaning (SQL)</w:t>
       </w:r>
     </w:p>
     <w:p>
       <w:pPr>
         <w:pStyle w:val="ListBullet"/>
+        <w:spacing w:after="0"/>
       </w:pPr>
       <w:r>
         <w:rPr>
           <w:sz w:val="20"/>
         </w:rPr>
-        <w:t>Skills: SQL, Python, healthcare public data, data quality definitions, reproducible proof</w:t>
+        <w:t>Cleaned 56,477 Metro Nashville sales rows: address recovery, duplicate closings, vacancy standardization</w:t>
       </w:r>
     </w:p>
     <w:p>
       <w:pPr>
-        <w:spacing w:after="20" w:before="0"/>
+        <w:spacing w:after="20"/>
       </w:pPr>
       <w:r>
         <w:rPr>
-          <w:b w:val="0"/>
+          <w:b/>
           <w:sz w:val="20"/>
         </w:rPr>
-        <w:t>Nashville Housing Data Cleanup (SQL)</w:t>
+        <w:t>Data Professionals Survey (Power BI)</w:t>
       </w:r>
     </w:p>
     <w:p>
       <w:pPr>
         <w:pStyle w:val="ListBullet"/>
+        <w:spacing w:after="0"/>
       </w:pPr>
       <w:r>
         <w:rPr>
           <w:sz w:val="20"/>
         </w:rPr>
-        <w:t>Cleaned and standardized 56,000+ Nashville housing records using SQL</w:t>
+        <w:t>Dashboard on 630 responses; salary patterns by role and education</w:t>
+      </w:r>
+    </w:p>
+    <w:p>
+      <w:pPr>
+        <w:spacing w:after="20"/>
+      </w:pPr>
+      <w:r>
+        <w:rPr>
+          <w:b/>
+          <w:sz w:val="20"/>
+        </w:rPr>
+        <w:t>Airbnb Seattle Analysis (Tableau)</w:t>
       </w:r>
     </w:p>
     <w:p>
       <w:pPr>
         <w:pStyle w:val="ListBullet"/>
+        <w:spacing w:after="0"/>
       </w:pPr>
       <w:r>
         <w:rPr>
           <w:sz w:val="20"/>
         </w:rPr>
-        <w:t>Removed duplicates, parsed addresses, normalized categorical fields</w:t>
+        <w:t>Joined listings/calendar/reviews; peak weekly revenue and bedroom pricing patterns</w:t>
       </w:r>
     </w:p>
     <w:p>
       <w:pPr>
-        <w:pStyle w:val="ListBullet"/>
+        <w:spacing w:after="20"/>
       </w:pPr>
       <w:r>
         <w:rPr>
-          <w:sz w:val="20"/>
-        </w:rPr>
-        <w:t>Skills: SQL, data cleaning, data standardization</w:t>
-      </w:r>
-    </w:p>
-    <w:p>
-      <w:pPr>
-        <w:spacing w:after="20" w:before="0"/>
-      </w:pPr>
-      <w:r>
-        <w:rPr>
-          <w:b w:val="0"/>
-          <w:sz w:val="20"/>
-        </w:rPr>
-        <w:t>Employee Survey Response Analysis (Power BI)</w:t>
-      </w:r>
-    </w:p>
-    <w:p>
-      <w:pPr>
-        <w:pStyle w:val="ListBullet"/>
-      </w:pPr>
-      <w:r>
-        <w:rPr>
-          <w:sz w:val="20"/>
-        </w:rPr>
-        <w:t>Built interactive Power BI dashboard analyzing employee satisfaction across departments</w:t>
-      </w:r>
-    </w:p>
-    <w:p>
-      <w:pPr>
-        <w:pStyle w:val="ListBullet"/>
-      </w:pPr>
-      <w:r>
-        <w:rPr>
-          <w:sz w:val="20"/>
-        </w:rPr>
-        <w:t>Identified key drivers of attrition using slicers and drill-through reports</w:t>
-      </w:r>
-    </w:p>
-    <w:p>
-      <w:pPr>
-        <w:pStyle w:val="ListBullet"/>
-      </w:pPr>
-      <w:r>
-        <w:rPr>
-          <w:sz w:val="20"/>
-        </w:rPr>
-        <w:t>Skills: Power BI, DAX, data visualization, HR analytics</w:t>
-      </w:r>
-    </w:p>
-    <w:p>
-      <w:pPr>
-        <w:spacing w:after="20" w:before="0"/>
-      </w:pPr>
-      <w:r>
-        <w:rPr>
-          <w:b w:val="0"/>
-          <w:sz w:val="20"/>
-        </w:rPr>
-        <w:t>Airbnb NYC Listings Analysis (Tableau)</w:t>
-      </w:r>
-    </w:p>
-    <w:p>
-      <w:pPr>
-        <w:pStyle w:val="ListBullet"/>
-      </w:pPr>
-      <w:r>
-        <w:rPr>
-          <w:sz w:val="20"/>
-        </w:rPr>
-        <w:t>Developed Tableau dashboard analyzing 20,000+ NYC Airbnb listings</w:t>
-      </w:r>
-    </w:p>
-    <w:p>
-      <w:pPr>
-        <w:pStyle w:val="ListBullet"/>
-      </w:pPr>
-      <w:r>
-        <w:rPr>
-          <w:sz w:val="20"/>
-        </w:rPr>
-        <w:t>Visualized pricing trends by neighborhood, room type, and availability</w:t>
-      </w:r>
-    </w:p>
-    <w:p>
-      <w:pPr>
-        <w:pStyle w:val="ListBullet"/>
-      </w:pPr>
-      <w:r>
-        <w:rPr>
-          <w:sz w:val="20"/>
-        </w:rPr>
-        <w:t>Skills: Tableau, geographic data, trend analysis</w:t>
-      </w:r>
-    </w:p>
-    <w:p>
-      <w:pPr>
-        <w:spacing w:after="20" w:before="0"/>
-      </w:pPr>
-      <w:r>
-        <w:rPr>
-          <w:b w:val="0"/>
+          <w:b/>
           <w:sz w:val="20"/>
         </w:rPr>
         <w:t>BMI Health Calculator (Python)</w:t>
@@ -394,32 +293,22 @@
     <w:p>
       <w:pPr>
         <w:pStyle w:val="ListBullet"/>
+        <w:spacing w:after="0"/>
       </w:pPr>
       <w:r>
         <w:rPr>
           <w:sz w:val="20"/>
         </w:rPr>
-        <w:t>Built Python script calculating BMI with weight/height inputs and health category output</w:t>
+        <w:t>Interactive BMI and WHR screening tool with transparent formulas</w:t>
       </w:r>
     </w:p>
     <w:p>
       <w:pPr>
-        <w:pStyle w:val="ListBullet"/>
+        <w:spacing w:after="20"/>
       </w:pPr>
       <w:r>
         <w:rPr>
-          <w:sz w:val="20"/>
-        </w:rPr>
-        <w:t>Skills: Python, user input handling, conditional logic</w:t>
-      </w:r>
-    </w:p>
-    <w:p>
-      <w:pPr>
-        <w:spacing w:after="20" w:before="0"/>
-      </w:pPr>
-      <w:r>
-        <w:rPr>
-          <w:b w:val="0"/>
+          <w:b/>
           <w:sz w:val="20"/>
         </w:rPr>
         <w:t>Bike Sales Dashboard (Excel)</w:t>
@@ -428,40 +317,14 @@
     <w:p>
       <w:pPr>
         <w:pStyle w:val="ListBullet"/>
+        <w:spacing w:after="0"/>
       </w:pPr>
       <w:r>
         <w:rPr>
           <w:sz w:val="20"/>
         </w:rPr>
-        <w:t>Created interactive Excel dashboard with pivot tables and slicers for bike sales data</w:t>
+        <w:t>Buyer segmentation with pivots and slicers</w:t>
       </w:r>
-    </w:p>
-    <w:p>
-      <w:pPr>
-        <w:pStyle w:val="ListBullet"/>
-      </w:pPr>
-      <w:r>
-        <w:rPr>
-          <w:sz w:val="20"/>
-        </w:rPr>
-        <w:t>Segmented data by demographics, region, and commute distance</w:t>
-      </w:r>
-    </w:p>
-    <w:p>
-      <w:pPr>
-        <w:pStyle w:val="ListBullet"/>
-      </w:pPr>
-      <w:r>
-        <w:rPr>
-          <w:sz w:val="20"/>
-        </w:rPr>
-        <w:t>Skills: Excel, pivot tables, data visualization, dashboard design</w:t>
-      </w:r>
-    </w:p>
-    <w:p>
-      <w:pPr>
-        <w:pStyle w:val="ListBullet"/>
-      </w:pPr>
     </w:p>
     <w:p>
       <w:pPr>
@@ -477,173 +340,87 @@
     </w:p>
     <w:p>
       <w:pPr>
-        <w:pStyle w:val="ListBullet"/>
-      </w:pPr>
-    </w:p>
-    <w:p>
-      <w:pPr>
-        <w:spacing w:after="20" w:before="0"/>
+        <w:spacing w:after="20"/>
       </w:pPr>
       <w:r>
         <w:rPr>
-          <w:b w:val="0"/>
+          <w:b/>
           <w:sz w:val="20"/>
         </w:rPr>
-        <w:t>EMS|MC (Emergency Medical Services Medical Center)</w:t>
-      </w:r>
-    </w:p>
-    <w:p>
-      <w:pPr>
-        <w:spacing w:after="20" w:before="0"/>
-      </w:pPr>
-      <w:r>
-        <w:rPr>
-          <w:b w:val="0"/>
-          <w:sz w:val="20"/>
-        </w:rPr>
-        <w:t>Mailroom Specialist | Chicago, IL</w:t>
+        <w:t>EMS Management and Consultants — Mailroom Specialist (Billing and Claims Operations)</w:t>
       </w:r>
     </w:p>
     <w:p>
       <w:pPr>
         <w:pStyle w:val="ListBullet"/>
+        <w:spacing w:after="0"/>
       </w:pPr>
       <w:r>
         <w:rPr>
           <w:sz w:val="20"/>
         </w:rPr>
-        <w:t>Processed and routed incoming/outgoing mail and packages across departments</w:t>
+        <w:t>Billing and claims operations support; Excel macro automation for repetitive entry</w:t>
       </w:r>
     </w:p>
     <w:p>
       <w:pPr>
         <w:pStyle w:val="ListBullet"/>
+        <w:spacing w:after="0"/>
       </w:pPr>
       <w:r>
         <w:rPr>
           <w:sz w:val="20"/>
         </w:rPr>
-        <w:t>Managed check processing, tape operations, and data entry workflows using Excel macros</w:t>
+        <w:t>Supported tape/check and data entry processes used by revenue cycle teams</w:t>
+      </w:r>
+    </w:p>
+    <w:p>
+      <w:pPr>
+        <w:spacing w:after="20"/>
+      </w:pPr>
+      <w:r>
+        <w:rPr>
+          <w:b/>
+          <w:sz w:val="20"/>
+        </w:rPr>
+        <w:t>Walmart — Associate | Palatine, IL</w:t>
       </w:r>
     </w:p>
     <w:p>
       <w:pPr>
         <w:pStyle w:val="ListBullet"/>
+        <w:spacing w:after="0"/>
       </w:pPr>
       <w:r>
         <w:rPr>
           <w:sz w:val="20"/>
         </w:rPr>
-        <w:t>Developed and maintained VBA macros to automate repetitive data entry tasks</w:t>
+        <w:t>Customer service, inventory, and store operations</w:t>
+      </w:r>
+    </w:p>
+    <w:p>
+      <w:pPr>
+        <w:spacing w:after="20"/>
+      </w:pPr>
+      <w:r>
+        <w:rPr>
+          <w:b/>
+          <w:sz w:val="20"/>
+        </w:rPr>
+        <w:t>Goodwill — Associate | Palatine, IL</w:t>
       </w:r>
     </w:p>
     <w:p>
       <w:pPr>
         <w:pStyle w:val="ListBullet"/>
+        <w:spacing w:after="0"/>
       </w:pPr>
       <w:r>
         <w:rPr>
           <w:sz w:val="20"/>
         </w:rPr>
-        <w:t>Utilized Microsoft Copilot to debug Visual Basic runtime errors during macro development</w:t>
+        <w:t>Customer assistance, merchandising, donations processing</w:t>
       </w:r>
-    </w:p>
-    <w:p>
-      <w:pPr>
-        <w:spacing w:after="20" w:before="0"/>
-      </w:pPr>
-      <w:r>
-        <w:rPr>
-          <w:b w:val="0"/>
-          <w:sz w:val="20"/>
-        </w:rPr>
-        <w:t>Walmart</w:t>
-      </w:r>
-    </w:p>
-    <w:p>
-      <w:pPr>
-        <w:spacing w:after="20" w:before="0"/>
-      </w:pPr>
-      <w:r>
-        <w:rPr>
-          <w:b w:val="0"/>
-          <w:sz w:val="20"/>
-        </w:rPr>
-        <w:t>Associate | Palatine, IL</w:t>
-      </w:r>
-    </w:p>
-    <w:p>
-      <w:pPr>
-        <w:pStyle w:val="ListBullet"/>
-      </w:pPr>
-      <w:r>
-        <w:rPr>
-          <w:sz w:val="20"/>
-        </w:rPr>
-        <w:t>Provided customer service and maintained store operations</w:t>
-      </w:r>
-    </w:p>
-    <w:p>
-      <w:pPr>
-        <w:pStyle w:val="ListBullet"/>
-      </w:pPr>
-      <w:r>
-        <w:rPr>
-          <w:sz w:val="20"/>
-        </w:rPr>
-        <w:t>Handled inventory management and product stocking</w:t>
-      </w:r>
-    </w:p>
-    <w:p>
-      <w:pPr>
-        <w:spacing w:after="20" w:before="0"/>
-      </w:pPr>
-      <w:r>
-        <w:rPr>
-          <w:b w:val="0"/>
-          <w:sz w:val="20"/>
-        </w:rPr>
-        <w:t>Goodwill</w:t>
-      </w:r>
-    </w:p>
-    <w:p>
-      <w:pPr>
-        <w:spacing w:after="20" w:before="0"/>
-      </w:pPr>
-      <w:r>
-        <w:rPr>
-          <w:b w:val="0"/>
-          <w:sz w:val="20"/>
-        </w:rPr>
-        <w:t>Associate | Palatine, IL</w:t>
-      </w:r>
-    </w:p>
-    <w:p>
-      <w:pPr>
-        <w:pStyle w:val="ListBullet"/>
-      </w:pPr>
-      <w:r>
-        <w:rPr>
-          <w:sz w:val="20"/>
-        </w:rPr>
-        <w:t>Assisted customers and maintained merchandise displays</w:t>
-      </w:r>
-    </w:p>
-    <w:p>
-      <w:pPr>
-        <w:pStyle w:val="ListBullet"/>
-      </w:pPr>
-      <w:r>
-        <w:rPr>
-          <w:sz w:val="20"/>
-        </w:rPr>
-        <w:t>Processed donations and managed sales floor organization</w:t>
-      </w:r>
-    </w:p>
-    <w:p>
-      <w:pPr>
-        <w:pStyle w:val="ListBullet"/>
-      </w:pPr>
     </w:p>
     <w:p>
       <w:pPr>
@@ -654,102 +431,36 @@
           <w:b/>
           <w:sz w:val="24"/>
         </w:rPr>
-        <w:t>EDUCATION</w:t>
+        <w:t>EDUCATION AND LEARNING</w:t>
       </w:r>
     </w:p>
     <w:p>
       <w:pPr>
-        <w:pStyle w:val="ListBullet"/>
-      </w:pPr>
-    </w:p>
-    <w:p>
-      <w:pPr>
-        <w:spacing w:after="20" w:before="0"/>
+        <w:spacing w:after="20"/>
       </w:pPr>
       <w:r>
         <w:rPr>
           <w:b w:val="0"/>
           <w:sz w:val="20"/>
         </w:rPr>
-        <w:t>Bachelor of Arts</w:t>
+        <w:t>Bachelor of Arts — Graduated 2022</w:t>
       </w:r>
     </w:p>
     <w:p>
       <w:pPr>
-        <w:spacing w:after="20" w:before="0"/>
+        <w:spacing w:after="20"/>
       </w:pPr>
       <w:r>
         <w:rPr>
           <w:b w:val="0"/>
           <w:sz w:val="20"/>
         </w:rPr>
-        <w:t>Graduated 2022</w:t>
+        <w:t>Ongoing analytics coursework; DataGlow local-first workbench: https://dataglow-platform.pplx.app</w:t>
       </w:r>
-    </w:p>
-    <w:p>
-      <w:pPr>
-        <w:spacing w:after="20" w:before="0"/>
-      </w:pPr>
-      <w:r>
-        <w:rPr>
-          <w:b w:val="0"/>
-          <w:sz w:val="20"/>
-        </w:rPr>
-        <w:t>Ongoing Learning:</w:t>
-      </w:r>
-    </w:p>
-    <w:p>
-      <w:pPr>
-        <w:pStyle w:val="ListBullet"/>
-      </w:pPr>
-      <w:r>
-        <w:rPr>
-          <w:sz w:val="20"/>
-        </w:rPr>
-        <w:t>Maven Analytics — Data Analytics portfolio coursework</w:t>
-      </w:r>
-    </w:p>
-    <w:p>
-      <w:pPr>
-        <w:pStyle w:val="ListBullet"/>
-      </w:pPr>
-      <w:r>
-        <w:rPr>
-          <w:sz w:val="20"/>
-        </w:rPr>
-        <w:t>Analyst Builder — SQL and Python certifications</w:t>
-      </w:r>
-    </w:p>
-    <w:p>
-      <w:pPr>
-        <w:pStyle w:val="ListBullet"/>
-      </w:pPr>
-      <w:r>
-        <w:rPr>
-          <w:sz w:val="20"/>
-        </w:rPr>
-        <w:t>Databricks Generative AI Associate Certificate (2024)</w:t>
-      </w:r>
-    </w:p>
-    <w:p>
-      <w:pPr>
-        <w:pStyle w:val="ListBullet"/>
-      </w:pPr>
-      <w:r>
-        <w:rPr>
-          <w:sz w:val="20"/>
-        </w:rPr>
-        <w:t>Databricks Certified Context Engineer Associate</w:t>
-      </w:r>
-    </w:p>
-    <w:p>
-      <w:pPr>
-        <w:pStyle w:val="ListBullet"/>
-      </w:pPr>
     </w:p>
     <w:sectPr>
       <w:pgSz w:w="12240" w:h="15840"/>
-      <w:pgMar w:top="864" w:right="1008" w:bottom="864" w:left="1008" w:header="720" w:footer="720" w:gutter="0"/>
+      <w:pgMar w:top="792" w:right="1008" w:bottom="792" w:left="1008" w:header="720" w:footer="720" w:gutter="0"/>
       <w:cols w:space="720"/>
       <w:docGrid w:linePitch="360"/>
     </w:sectPr>

</xml_diff>